<commit_message>
report: real commit counts from git shortlog after the last merge
</commit_message>
<xml_diff>
--- a/docs/Requirement_Report.docx
+++ b/docs/Requirement_Report.docx
@@ -9636,6 +9636,15 @@
         <w:t xml:space="preserve">13.2 Contribution summary</w:t>
       </w:r>
     </w:p>
+    <w:p>
+      <w:pPr>
+        <w:spacing w:after="120" w:line="276"/>
+        <w:jc w:val="both"/>
+      </w:pPr>
+      <w:r>
+        <w:t xml:space="preserve">Counted with git shortlog on main immediately after pull request #6 was merged.</w:t>
+      </w:r>
+    </w:p>
     <w:tbl>
       <w:tblPr>
         <w:tblW w:type="dxa" w:w="9360"/>
@@ -9842,7 +9851,7 @@
                 <w:sz w:val="19"/>
                 <w:szCs w:val="19"/>
               </w:rPr>
-              <w:t xml:space="preserve">11 feature commits + 6 merge commits</w:t>
+              <w:t xml:space="preserve">19 (13 of his own, 6 pull-request merges)</w:t>
             </w:r>
           </w:p>
         </w:tc>
@@ -10054,7 +10063,7 @@
                 <w:sz w:val="19"/>
                 <w:szCs w:val="19"/>
               </w:rPr>
-              <w:t xml:space="preserve">11 (including one branch merge)</w:t>
+              <w:t xml:space="preserve">11 (10 of his own, 1 conflict merge)</w:t>
             </w:r>
           </w:p>
         </w:tc>
@@ -10160,7 +10169,7 @@
                 <w:sz w:val="19"/>
                 <w:szCs w:val="19"/>
               </w:rPr>
-              <w:t xml:space="preserve">35 commits, 6 branches, 6 pull requests</w:t>
+              <w:t xml:space="preserve">37 commits, 6 branches, 6 pull requests</w:t>
             </w:r>
           </w:p>
         </w:tc>

</xml_diff>